<commit_message>
Site updated: 2025-12-29 23:06:36
</commit_message>
<xml_diff>
--- a/ppt/doc.docx
+++ b/ppt/doc.docx
@@ -5,32 +5,296 @@
     <w:p>
       <w:pPr>
         <w:rPr>
-          <w:rFonts w:hint="eastAsia" w:eastAsiaTheme="minorEastAsia"/>
-          <w:sz w:val="28"/>
-          <w:szCs w:val="36"/>
-          <w:lang w:val="en-US" w:eastAsia="zh-CN"/>
-        </w:rPr>
-      </w:pPr>
-      <w:r>
-        <w:rPr>
-          <w:rFonts w:hint="eastAsia"/>
-          <w:sz w:val="28"/>
-          <w:szCs w:val="36"/>
-          <w:lang w:val="en-US" w:eastAsia="zh-CN"/>
-        </w:rPr>
-        <w:t xml:space="preserve">[Yun]:Good morning.Today we will explore a powerful wapons that called </w:t>
-      </w:r>
-      <w:r>
-        <w:rPr>
-          <w:rFonts w:hint="eastAsia"/>
-          <w:sz w:val="28"/>
-          <w:szCs w:val="36"/>
-        </w:rPr>
-        <w:t>electromagnetic railgun</w:t>
-      </w:r>
-      <w:r>
-        <w:rPr>
-          <w:rFonts w:hint="eastAsia"/>
+          <w:rFonts w:hint="eastAsia"/>
+          <w:sz w:val="28"/>
+          <w:szCs w:val="36"/>
+          <w:lang w:val="en-US" w:eastAsia="zh-CN"/>
+        </w:rPr>
+      </w:pPr>
+      <w:r>
+        <w:rPr>
+          <w:rFonts w:hint="eastAsia"/>
+          <w:sz w:val="28"/>
+          <w:szCs w:val="36"/>
+          <w:lang w:val="en-US" w:eastAsia="zh-CN"/>
+        </w:rPr>
+        <w:t>[Yun]:Good morning.</w:t>
+      </w:r>
+    </w:p>
+    <w:p>
+      <w:pPr>
+        <w:rPr>
+          <w:rFonts w:hint="eastAsia"/>
+          <w:sz w:val="28"/>
+          <w:szCs w:val="36"/>
+          <w:lang w:val="en-US" w:eastAsia="zh-CN"/>
+        </w:rPr>
+      </w:pPr>
+      <w:r>
+        <w:rPr>
+          <w:rFonts w:hint="eastAsia"/>
+          <w:sz w:val="28"/>
+          <w:szCs w:val="36"/>
+          <w:lang w:val="en-US" w:eastAsia="zh-CN"/>
+        </w:rPr>
+        <w:t>With the advancement of technology, the weapons used to protect the nation have undergone tremendous changes. Let us explore this through an example.</w:t>
+      </w:r>
+    </w:p>
+    <w:p>
+      <w:pPr>
+        <w:rPr>
+          <w:rFonts w:hint="eastAsia"/>
+          <w:sz w:val="28"/>
+          <w:szCs w:val="36"/>
+          <w:lang w:val="en-US" w:eastAsia="zh-CN"/>
+        </w:rPr>
+      </w:pPr>
+      <w:r>
+        <w:rPr>
+          <w:rFonts w:hint="eastAsia"/>
+          <w:sz w:val="28"/>
+          <w:szCs w:val="36"/>
+          <w:lang w:val="en-US" w:eastAsia="zh-CN"/>
+        </w:rPr>
+        <w:t>This is a video of a delivery locker being opened.This is a miniature, low-speed, precision version of electromagnetic catapulting.</w:t>
+      </w:r>
+    </w:p>
+    <w:p>
+      <w:pPr>
+        <w:rPr>
+          <w:rFonts w:hint="default"/>
+          <w:sz w:val="28"/>
+          <w:szCs w:val="36"/>
+          <w:lang w:val="en-US" w:eastAsia="zh-CN"/>
+        </w:rPr>
+      </w:pPr>
+      <w:r>
+        <w:rPr>
+          <w:rFonts w:hint="default"/>
+          <w:sz w:val="28"/>
+          <w:szCs w:val="36"/>
+          <w:lang w:val="en-US" w:eastAsia="zh-CN"/>
+        </w:rPr>
+        <w:t>This weapon employs the same technology, but is applied in a different domain.</w:t>
+      </w:r>
+      <w:r>
+        <w:rPr>
+          <w:rFonts w:hint="eastAsia"/>
+          <w:sz w:val="28"/>
+          <w:szCs w:val="36"/>
+          <w:lang w:val="en-US" w:eastAsia="zh-CN"/>
+        </w:rPr>
+        <w:t>Can you guess what it is?</w:t>
+      </w:r>
+    </w:p>
+    <w:p>
+      <w:pPr>
+        <w:rPr>
+          <w:rFonts w:hint="eastAsia"/>
+          <w:sz w:val="28"/>
+          <w:szCs w:val="36"/>
+          <w:lang w:val="en-US" w:eastAsia="zh-CN"/>
+        </w:rPr>
+      </w:pPr>
+      <w:r>
+        <w:rPr>
+          <w:rFonts w:hint="eastAsia"/>
+          <w:sz w:val="28"/>
+          <w:szCs w:val="36"/>
+          <w:lang w:val="en-US" w:eastAsia="zh-CN"/>
+        </w:rPr>
+        <w:t>（评委回答后）</w:t>
+      </w:r>
+    </w:p>
+    <w:p>
+      <w:pPr>
+        <w:rPr>
+          <w:rFonts w:hint="eastAsia"/>
+          <w:sz w:val="28"/>
+          <w:szCs w:val="36"/>
+          <w:lang w:val="en-US" w:eastAsia="zh-CN"/>
+        </w:rPr>
+      </w:pPr>
+      <w:r>
+        <w:rPr>
+          <w:rFonts w:hint="eastAsia"/>
+          <w:sz w:val="28"/>
+          <w:szCs w:val="36"/>
+          <w:lang w:val="en-US" w:eastAsia="zh-CN"/>
+        </w:rPr>
+        <w:t>This is an electromagnetic railgun.</w:t>
+      </w:r>
+    </w:p>
+    <w:p>
+      <w:pPr>
+        <w:rPr>
+          <w:rFonts w:hint="eastAsia"/>
+          <w:sz w:val="28"/>
+          <w:szCs w:val="36"/>
+        </w:rPr>
+      </w:pPr>
+      <w:r>
+        <w:rPr>
+          <w:rFonts w:hint="eastAsia"/>
+          <w:sz w:val="28"/>
+          <w:szCs w:val="36"/>
+        </w:rPr>
+        <w:t>An electromagnetic railgun is a next-generation weapon. It uses electromagnetic force to propel projectiles at hypersonic speeds without explosives, offering unprecedented range and impact.</w:t>
+      </w:r>
+    </w:p>
+    <w:p>
+      <w:pPr>
+        <w:rPr>
+          <w:rFonts w:hint="eastAsia"/>
+          <w:sz w:val="28"/>
+          <w:szCs w:val="36"/>
+          <w:lang w:val="en-US" w:eastAsia="zh-CN"/>
+        </w:rPr>
+      </w:pPr>
+      <w:r>
+        <w:rPr>
+          <w:rFonts w:hint="eastAsia"/>
+          <w:sz w:val="28"/>
+          <w:szCs w:val="36"/>
+          <w:lang w:val="en-US" w:eastAsia="zh-CN"/>
+        </w:rPr>
+        <w:t>[Fan]:Electromagnetic railgun is a powerful weapon of a strong country, let us explore how it works.</w:t>
+      </w:r>
+    </w:p>
+    <w:p>
+      <w:pPr>
+        <w:rPr>
+          <w:rFonts w:hint="default"/>
+          <w:sz w:val="28"/>
+          <w:szCs w:val="36"/>
+          <w:lang w:val="en-US" w:eastAsia="zh-CN"/>
+        </w:rPr>
+      </w:pPr>
+      <w:r>
+        <w:rPr>
+          <w:rFonts w:hint="default"/>
+          <w:sz w:val="28"/>
+          <w:szCs w:val="36"/>
+          <w:lang w:val="en-US" w:eastAsia="zh-CN"/>
+        </w:rPr>
+        <w:t>When the screw is energized, it moves forward due to magnetic field induction within the magnet.</w:t>
+      </w:r>
+    </w:p>
+    <w:p>
+      <w:pPr>
+        <w:rPr>
+          <w:rFonts w:hint="default"/>
+          <w:sz w:val="28"/>
+          <w:szCs w:val="36"/>
+          <w:lang w:val="en-US" w:eastAsia="zh-CN"/>
+        </w:rPr>
+      </w:pPr>
+      <w:r>
+        <w:rPr>
+          <w:rFonts w:hint="default"/>
+          <w:sz w:val="28"/>
+          <w:szCs w:val="36"/>
+          <w:lang w:val="en-US" w:eastAsia="zh-CN"/>
+        </w:rPr>
+        <w:t>Increasing the current enhances and the magnetic field, causing this screw to move forward more rapidly.</w:t>
+      </w:r>
+    </w:p>
+    <w:p>
+      <w:pPr>
+        <w:rPr>
+          <w:rFonts w:hint="default"/>
+          <w:sz w:val="28"/>
+          <w:szCs w:val="36"/>
+          <w:lang w:val="en-US" w:eastAsia="zh-CN"/>
+        </w:rPr>
+      </w:pPr>
+      <w:r>
+        <w:rPr>
+          <w:rFonts w:hint="eastAsia"/>
+          <w:sz w:val="28"/>
+          <w:szCs w:val="36"/>
+          <w:lang w:val="en-US" w:eastAsia="zh-CN"/>
+        </w:rPr>
+        <w:t>Then r</w:t>
+      </w:r>
+      <w:r>
+        <w:rPr>
+          <w:rFonts w:hint="default"/>
+          <w:sz w:val="28"/>
+          <w:szCs w:val="36"/>
+          <w:lang w:val="en-US" w:eastAsia="zh-CN"/>
+        </w:rPr>
+        <w:t>eplace the nails with cannonballs.</w:t>
+      </w:r>
+    </w:p>
+    <w:p>
+      <w:pPr>
+        <w:rPr>
+          <w:rFonts w:hint="default"/>
+          <w:sz w:val="28"/>
+          <w:szCs w:val="36"/>
+          <w:lang w:val="en-US" w:eastAsia="zh-CN"/>
+        </w:rPr>
+      </w:pPr>
+      <w:r>
+        <w:rPr>
+          <w:rFonts w:hint="default"/>
+          <w:sz w:val="28"/>
+          <w:szCs w:val="36"/>
+          <w:lang w:val="en-US" w:eastAsia="zh-CN"/>
+        </w:rPr>
+        <w:t>Add sliding rails on both sides of the projectile to ensure tight contact and allow current to pass through.</w:t>
+      </w:r>
+    </w:p>
+    <w:p>
+      <w:pPr>
+        <w:rPr>
+          <w:rFonts w:hint="default"/>
+          <w:sz w:val="28"/>
+          <w:szCs w:val="36"/>
+          <w:lang w:val="en-US" w:eastAsia="zh-CN"/>
+        </w:rPr>
+      </w:pPr>
+      <w:r>
+        <w:rPr>
+          <w:rFonts w:hint="default"/>
+          <w:sz w:val="28"/>
+          <w:szCs w:val="36"/>
+          <w:lang w:val="en-US" w:eastAsia="zh-CN"/>
+        </w:rPr>
+        <w:t>When energized, an electromagnetic field is generated. According to the right-hand rule, the direction of the magnetic field lines in the rail can be determined.</w:t>
+      </w:r>
+    </w:p>
+    <w:p>
+      <w:pPr>
+        <w:rPr>
+          <w:rFonts w:hint="default"/>
+          <w:sz w:val="28"/>
+          <w:szCs w:val="36"/>
+          <w:lang w:val="en-US" w:eastAsia="zh-CN"/>
+        </w:rPr>
+      </w:pPr>
+      <w:r>
+        <w:rPr>
+          <w:rFonts w:hint="default"/>
+          <w:sz w:val="28"/>
+          <w:szCs w:val="36"/>
+          <w:lang w:val="en-US" w:eastAsia="zh-CN"/>
+        </w:rPr>
+        <w:t>This way, we obtain the basic model of the</w:t>
+      </w:r>
+      <w:r>
+        <w:rPr>
+          <w:rFonts w:hint="eastAsia"/>
+          <w:sz w:val="28"/>
+          <w:szCs w:val="36"/>
+          <w:lang w:val="en-US" w:eastAsia="zh-CN"/>
+        </w:rPr>
+        <w:t xml:space="preserve"> electromagnetic railgun</w:t>
+      </w:r>
+      <w:r>
+        <w:rPr>
+          <w:rFonts w:hint="default"/>
           <w:sz w:val="28"/>
           <w:szCs w:val="36"/>
           <w:lang w:val="en-US" w:eastAsia="zh-CN"/>
@@ -41,48 +305,124 @@
     <w:p>
       <w:pPr>
         <w:rPr>
-          <w:rFonts w:hint="eastAsia"/>
-          <w:sz w:val="28"/>
-          <w:szCs w:val="36"/>
-          <w:lang w:val="en-US" w:eastAsia="zh-CN"/>
-        </w:rPr>
-      </w:pPr>
-      <w:r>
-        <w:rPr>
-          <w:rFonts w:hint="eastAsia"/>
-          <w:sz w:val="28"/>
-          <w:szCs w:val="36"/>
-          <w:lang w:val="en-US" w:eastAsia="zh-CN"/>
-        </w:rPr>
-        <w:t>[Yun]:The first question is what is an electromagnetic railgun?</w:t>
-      </w:r>
-    </w:p>
-    <w:p>
-      <w:pPr>
-        <w:rPr>
-          <w:rFonts w:hint="eastAsia"/>
-          <w:sz w:val="28"/>
-          <w:szCs w:val="36"/>
-        </w:rPr>
-      </w:pPr>
-      <w:r>
-        <w:rPr>
-          <w:rFonts w:hint="eastAsia"/>
-          <w:sz w:val="28"/>
-          <w:szCs w:val="36"/>
-        </w:rPr>
-        <w:t>An electromagnetic railgun is a next-generation weapon. It uses electromagnetic force to propel projectiles at hypersonic speeds without explosives, offering unprecedented range and impact.</w:t>
-      </w:r>
-    </w:p>
-    <w:p>
-      <w:pPr>
-        <w:rPr>
-          <w:rFonts w:hint="eastAsia"/>
-          <w:sz w:val="28"/>
-          <w:szCs w:val="36"/>
-          <w:lang w:val="en-US" w:eastAsia="zh-CN"/>
-        </w:rPr>
-      </w:pPr>
+          <w:rFonts w:hint="default"/>
+          <w:sz w:val="28"/>
+          <w:szCs w:val="36"/>
+          <w:lang w:val="en-US" w:eastAsia="zh-CN"/>
+        </w:rPr>
+      </w:pPr>
+      <w:r>
+        <w:rPr>
+          <w:rFonts w:hint="eastAsia"/>
+          <w:sz w:val="28"/>
+          <w:szCs w:val="36"/>
+          <w:lang w:val="en-US" w:eastAsia="zh-CN"/>
+        </w:rPr>
+        <w:t>[Bei]</w:t>
+      </w:r>
+      <w:r>
+        <w:rPr>
+          <w:rFonts w:hint="default"/>
+          <w:sz w:val="28"/>
+          <w:szCs w:val="36"/>
+          <w:lang w:val="en-US" w:eastAsia="zh-CN"/>
+        </w:rPr>
+        <w:t>Theoretically, the</w:t>
+      </w:r>
+      <w:r>
+        <w:rPr>
+          <w:rFonts w:hint="eastAsia"/>
+          <w:sz w:val="28"/>
+          <w:szCs w:val="36"/>
+          <w:lang w:val="en-US" w:eastAsia="zh-CN"/>
+        </w:rPr>
+        <w:t xml:space="preserve"> electromagnetic railgun</w:t>
+      </w:r>
+      <w:r>
+        <w:rPr>
+          <w:rFonts w:hint="default"/>
+          <w:sz w:val="28"/>
+          <w:szCs w:val="36"/>
+          <w:lang w:val="en-US" w:eastAsia="zh-CN"/>
+        </w:rPr>
+        <w:t xml:space="preserve"> can achieve a speed of 2000 m/s.</w:t>
+      </w:r>
+    </w:p>
+    <w:p>
+      <w:pPr>
+        <w:rPr>
+          <w:rFonts w:hint="default"/>
+          <w:sz w:val="28"/>
+          <w:szCs w:val="36"/>
+          <w:lang w:val="en-US" w:eastAsia="zh-CN"/>
+        </w:rPr>
+      </w:pPr>
+      <w:r>
+        <w:rPr>
+          <w:rFonts w:hint="default"/>
+          <w:sz w:val="28"/>
+          <w:szCs w:val="36"/>
+          <w:lang w:val="en-US" w:eastAsia="zh-CN"/>
+        </w:rPr>
+        <w:t>This translates to 7200 km/h, approximately 5.8 times the speed of sound.</w:t>
+      </w:r>
+    </w:p>
+    <w:p>
+      <w:pPr>
+        <w:rPr>
+          <w:rFonts w:hint="eastAsia"/>
+          <w:sz w:val="28"/>
+          <w:szCs w:val="36"/>
+          <w:lang w:val="en-US" w:eastAsia="zh-CN"/>
+        </w:rPr>
+      </w:pPr>
+      <w:r>
+        <w:rPr>
+          <w:rFonts w:hint="eastAsia"/>
+          <w:sz w:val="28"/>
+          <w:szCs w:val="36"/>
+          <w:lang w:val="en-US" w:eastAsia="zh-CN"/>
+        </w:rPr>
+        <w:t>The benefits are transformative. It offers unmatched speed and range, striking targets over the horizon. The kinetic impact is devastating. It's also safer for the crew and allows for a deeper ammunition magazine at a potentially lower cost per engagement.</w:t>
+      </w:r>
+    </w:p>
+    <w:p>
+      <w:pPr>
+        <w:rPr>
+          <w:rFonts w:hint="eastAsia"/>
+          <w:sz w:val="28"/>
+          <w:szCs w:val="36"/>
+          <w:lang w:val="en-US" w:eastAsia="zh-CN"/>
+        </w:rPr>
+      </w:pPr>
+      <w:r>
+        <w:rPr>
+          <w:rFonts w:hint="eastAsia"/>
+          <w:sz w:val="28"/>
+          <w:szCs w:val="36"/>
+          <w:lang w:val="en-US" w:eastAsia="zh-CN"/>
+        </w:rPr>
+        <w:t>[Yun]However, significant challenges remain. Barrel lifespan, monumental power requirements, and thermal management are critical engineering puzzles. The system is also large and complex to integrate onto existing platforms.</w:t>
+      </w:r>
+    </w:p>
+    <w:p>
+      <w:pPr>
+        <w:rPr>
+          <w:rFonts w:hint="default"/>
+          <w:sz w:val="28"/>
+          <w:szCs w:val="36"/>
+          <w:lang w:val="en-US" w:eastAsia="zh-CN"/>
+        </w:rPr>
+      </w:pPr>
+      <w:r>
+        <w:rPr>
+          <w:rFonts w:hint="eastAsia"/>
+          <w:sz w:val="28"/>
+          <w:szCs w:val="36"/>
+          <w:lang w:val="en-US" w:eastAsia="zh-CN"/>
+        </w:rPr>
+        <w:t>[Yun]In conclusion, the el</w:t>
+      </w:r>
       <w:bookmarkStart w:id="0" w:name="_GoBack"/>
       <w:bookmarkEnd w:id="0"/>
       <w:r>
@@ -92,306 +432,7 @@
           <w:szCs w:val="36"/>
           <w:lang w:val="en-US" w:eastAsia="zh-CN"/>
         </w:rPr>
-        <w:t>[Fan]:Electromagnetic railgun is a powerful weapon of a strong country, let us explore how it works.</w:t>
-      </w:r>
-    </w:p>
-    <w:p>
-      <w:pPr>
-        <w:rPr>
-          <w:rFonts w:hint="default"/>
-          <w:sz w:val="28"/>
-          <w:szCs w:val="36"/>
-          <w:lang w:val="en-US" w:eastAsia="zh-CN"/>
-        </w:rPr>
-      </w:pPr>
-      <w:r>
-        <w:rPr>
-          <w:rFonts w:hint="eastAsia"/>
-          <w:sz w:val="28"/>
-          <w:szCs w:val="36"/>
-          <w:lang w:val="en-US" w:eastAsia="zh-CN"/>
-        </w:rPr>
-        <w:t>[Bei]</w:t>
-      </w:r>
-      <w:r>
-        <w:rPr>
-          <w:rFonts w:hint="default"/>
-          <w:sz w:val="28"/>
-          <w:szCs w:val="36"/>
-          <w:lang w:val="en-US" w:eastAsia="zh-CN"/>
-        </w:rPr>
-        <w:t>When the screw is energized, it moves forward due to magnetic field induction within the magnet.</w:t>
-      </w:r>
-    </w:p>
-    <w:p>
-      <w:pPr>
-        <w:rPr>
-          <w:rFonts w:hint="default"/>
-          <w:sz w:val="28"/>
-          <w:szCs w:val="36"/>
-          <w:lang w:val="en-US" w:eastAsia="zh-CN"/>
-        </w:rPr>
-      </w:pPr>
-      <w:r>
-        <w:rPr>
-          <w:rFonts w:hint="eastAsia"/>
-          <w:sz w:val="28"/>
-          <w:szCs w:val="36"/>
-          <w:lang w:val="en-US" w:eastAsia="zh-CN"/>
-        </w:rPr>
-        <w:t>[Bei]</w:t>
-      </w:r>
-      <w:r>
-        <w:rPr>
-          <w:rFonts w:hint="default"/>
-          <w:sz w:val="28"/>
-          <w:szCs w:val="36"/>
-          <w:lang w:val="en-US" w:eastAsia="zh-CN"/>
-        </w:rPr>
-        <w:t>Increasing the current enhances and the magnetic field, causing this screw to move forward more rapidly.</w:t>
-      </w:r>
-    </w:p>
-    <w:p>
-      <w:pPr>
-        <w:rPr>
-          <w:rFonts w:hint="default"/>
-          <w:sz w:val="28"/>
-          <w:szCs w:val="36"/>
-          <w:lang w:val="en-US" w:eastAsia="zh-CN"/>
-        </w:rPr>
-      </w:pPr>
-      <w:r>
-        <w:rPr>
-          <w:rFonts w:hint="eastAsia"/>
-          <w:sz w:val="28"/>
-          <w:szCs w:val="36"/>
-          <w:lang w:val="en-US" w:eastAsia="zh-CN"/>
-        </w:rPr>
-        <w:t>[Bei]</w:t>
-      </w:r>
-      <w:r>
-        <w:rPr>
-          <w:rFonts w:hint="default"/>
-          <w:sz w:val="28"/>
-          <w:szCs w:val="36"/>
-          <w:lang w:val="en-US" w:eastAsia="zh-CN"/>
-        </w:rPr>
-        <w:t>Replace the nails with cannonballs.</w:t>
-      </w:r>
-    </w:p>
-    <w:p>
-      <w:pPr>
-        <w:rPr>
-          <w:rFonts w:hint="default"/>
-          <w:sz w:val="28"/>
-          <w:szCs w:val="36"/>
-          <w:lang w:val="en-US" w:eastAsia="zh-CN"/>
-        </w:rPr>
-      </w:pPr>
-      <w:r>
-        <w:rPr>
-          <w:rFonts w:hint="eastAsia"/>
-          <w:sz w:val="28"/>
-          <w:szCs w:val="36"/>
-          <w:lang w:val="en-US" w:eastAsia="zh-CN"/>
-        </w:rPr>
-        <w:t>[Yun]</w:t>
-      </w:r>
-      <w:r>
-        <w:rPr>
-          <w:rFonts w:hint="default"/>
-          <w:sz w:val="28"/>
-          <w:szCs w:val="36"/>
-          <w:lang w:val="en-US" w:eastAsia="zh-CN"/>
-        </w:rPr>
-        <w:t>Add sliding rails on both sides of the projectile to ensure tight contact and allow current to pass through.</w:t>
-      </w:r>
-    </w:p>
-    <w:p>
-      <w:pPr>
-        <w:rPr>
-          <w:rFonts w:hint="default"/>
-          <w:sz w:val="28"/>
-          <w:szCs w:val="36"/>
-          <w:lang w:val="en-US" w:eastAsia="zh-CN"/>
-        </w:rPr>
-      </w:pPr>
-      <w:r>
-        <w:rPr>
-          <w:rFonts w:hint="eastAsia"/>
-          <w:sz w:val="28"/>
-          <w:szCs w:val="36"/>
-          <w:lang w:val="en-US" w:eastAsia="zh-CN"/>
-        </w:rPr>
-        <w:t>[Yun]</w:t>
-      </w:r>
-      <w:r>
-        <w:rPr>
-          <w:rFonts w:hint="default"/>
-          <w:sz w:val="28"/>
-          <w:szCs w:val="36"/>
-          <w:lang w:val="en-US" w:eastAsia="zh-CN"/>
-        </w:rPr>
-        <w:t>When energized, an electromagnetic field is generated. According to the right-hand rule, the direction of the magnetic field lines in the rail can be determined.</w:t>
-      </w:r>
-    </w:p>
-    <w:p>
-      <w:pPr>
-        <w:rPr>
-          <w:rFonts w:hint="default"/>
-          <w:sz w:val="28"/>
-          <w:szCs w:val="36"/>
-          <w:lang w:val="en-US" w:eastAsia="zh-CN"/>
-        </w:rPr>
-      </w:pPr>
-      <w:r>
-        <w:rPr>
-          <w:rFonts w:hint="eastAsia"/>
-          <w:sz w:val="28"/>
-          <w:szCs w:val="36"/>
-          <w:lang w:val="en-US" w:eastAsia="zh-CN"/>
-        </w:rPr>
-        <w:t>[Fan]</w:t>
-      </w:r>
-      <w:r>
-        <w:rPr>
-          <w:rFonts w:hint="default"/>
-          <w:sz w:val="28"/>
-          <w:szCs w:val="36"/>
-          <w:lang w:val="en-US" w:eastAsia="zh-CN"/>
-        </w:rPr>
-        <w:t>This way, we obtain the basic model of the</w:t>
-      </w:r>
-      <w:r>
-        <w:rPr>
-          <w:rFonts w:hint="eastAsia"/>
-          <w:sz w:val="28"/>
-          <w:szCs w:val="36"/>
-          <w:lang w:val="en-US" w:eastAsia="zh-CN"/>
-        </w:rPr>
-        <w:t xml:space="preserve"> electromagnetic railgun</w:t>
-      </w:r>
-      <w:r>
-        <w:rPr>
-          <w:rFonts w:hint="default"/>
-          <w:sz w:val="28"/>
-          <w:szCs w:val="36"/>
-          <w:lang w:val="en-US" w:eastAsia="zh-CN"/>
-        </w:rPr>
-        <w:t>.</w:t>
-      </w:r>
-    </w:p>
-    <w:p>
-      <w:pPr>
-        <w:rPr>
-          <w:rFonts w:hint="default"/>
-          <w:sz w:val="28"/>
-          <w:szCs w:val="36"/>
-          <w:lang w:val="en-US" w:eastAsia="zh-CN"/>
-        </w:rPr>
-      </w:pPr>
-      <w:r>
-        <w:rPr>
-          <w:rFonts w:hint="default"/>
-          <w:sz w:val="28"/>
-          <w:szCs w:val="36"/>
-          <w:lang w:val="en-US" w:eastAsia="zh-CN"/>
-        </w:rPr>
-        <w:t>Theoretically, the</w:t>
-      </w:r>
-      <w:r>
-        <w:rPr>
-          <w:rFonts w:hint="eastAsia"/>
-          <w:sz w:val="28"/>
-          <w:szCs w:val="36"/>
-          <w:lang w:val="en-US" w:eastAsia="zh-CN"/>
-        </w:rPr>
-        <w:t xml:space="preserve"> electromagnetic railgun</w:t>
-      </w:r>
-      <w:r>
-        <w:rPr>
-          <w:rFonts w:hint="default"/>
-          <w:sz w:val="28"/>
-          <w:szCs w:val="36"/>
-          <w:lang w:val="en-US" w:eastAsia="zh-CN"/>
-        </w:rPr>
-        <w:t xml:space="preserve"> can achieve a speed of 2000 m/s.</w:t>
-      </w:r>
-    </w:p>
-    <w:p>
-      <w:pPr>
-        <w:rPr>
-          <w:rFonts w:hint="default"/>
-          <w:sz w:val="28"/>
-          <w:szCs w:val="36"/>
-          <w:lang w:val="en-US" w:eastAsia="zh-CN"/>
-        </w:rPr>
-      </w:pPr>
-      <w:r>
-        <w:rPr>
-          <w:rFonts w:hint="default"/>
-          <w:sz w:val="28"/>
-          <w:szCs w:val="36"/>
-          <w:lang w:val="en-US" w:eastAsia="zh-CN"/>
-        </w:rPr>
-        <w:t>This translates to 7200 km/h, approximately 5.8 times the speed of sound.</w:t>
-      </w:r>
-    </w:p>
-    <w:p>
-      <w:pPr>
-        <w:rPr>
-          <w:rFonts w:hint="eastAsia"/>
-          <w:sz w:val="28"/>
-          <w:szCs w:val="36"/>
-          <w:lang w:val="en-US" w:eastAsia="zh-CN"/>
-        </w:rPr>
-      </w:pPr>
-      <w:r>
-        <w:rPr>
-          <w:rFonts w:hint="eastAsia"/>
-          <w:sz w:val="28"/>
-          <w:szCs w:val="36"/>
-          <w:lang w:val="en-US" w:eastAsia="zh-CN"/>
-        </w:rPr>
-        <w:t>[Bei]The benefits are transformative. It offers unmatched speed and range, striking targets over the horizon. The kinetic impact is devastating. It's also safer for the crew and allows for a deeper ammunition magazine at a potentially lower cost per engagement.</w:t>
-      </w:r>
-    </w:p>
-    <w:p>
-      <w:pPr>
-        <w:rPr>
-          <w:rFonts w:hint="eastAsia"/>
-          <w:sz w:val="28"/>
-          <w:szCs w:val="36"/>
-          <w:lang w:val="en-US" w:eastAsia="zh-CN"/>
-        </w:rPr>
-      </w:pPr>
-      <w:r>
-        <w:rPr>
-          <w:rFonts w:hint="eastAsia"/>
-          <w:sz w:val="28"/>
-          <w:szCs w:val="36"/>
-          <w:lang w:val="en-US" w:eastAsia="zh-CN"/>
-        </w:rPr>
-        <w:t>[Yun]However, significant challenges remain. Barrel lifespan, monumental power requirements, and thermal management are critical engineering puzzles. The system is also large and complex to integrate onto existing platforms.</w:t>
-      </w:r>
-    </w:p>
-    <w:p>
-      <w:pPr>
-        <w:rPr>
-          <w:rFonts w:hint="eastAsia"/>
-          <w:sz w:val="28"/>
-          <w:szCs w:val="36"/>
-          <w:lang w:val="en-US" w:eastAsia="zh-CN"/>
-        </w:rPr>
-      </w:pPr>
-      <w:r>
-        <w:rPr>
-          <w:rFonts w:hint="eastAsia"/>
-          <w:sz w:val="28"/>
-          <w:szCs w:val="36"/>
-          <w:lang w:val="en-US" w:eastAsia="zh-CN"/>
-        </w:rPr>
-        <w:t>[Yun]In conclusion, the electromagnetic railgun represents a paradigm shift from chemical to electromagnetic propulsion. While not yet fully operational, its potential to reshape naval warfare is undeniable. It symbolizes the critical intersection of cutting-edge physics, engineering, and defense strategy. The race to master this technology is on</w:t>
+        <w:t>ectromagnetic railgun represents a paradigm shift from chemical to electromagnetic propulsion. While not yet fully operational, its potential to reshape naval warfare is undeniable. It symbolizes the critical intersection of cutting-edge physics, engineering, and defense strategy. The race to master this technology is on.</w:t>
       </w:r>
     </w:p>
     <w:p>
@@ -499,7 +540,7 @@
     <w:lsdException w:qFormat="1" w:unhideWhenUsed="0" w:uiPriority="0" w:semiHidden="0" w:name="Title"/>
     <w:lsdException w:unhideWhenUsed="0" w:uiPriority="0" w:semiHidden="0" w:name="Closing"/>
     <w:lsdException w:unhideWhenUsed="0" w:uiPriority="0" w:semiHidden="0" w:name="Signature"/>
-    <w:lsdException w:unhideWhenUsed="0" w:uiPriority="0" w:name="Default Paragraph Font"/>
+    <w:lsdException w:qFormat="1" w:unhideWhenUsed="0" w:uiPriority="0" w:name="Default Paragraph Font"/>
     <w:lsdException w:unhideWhenUsed="0" w:uiPriority="0" w:semiHidden="0" w:name="Body Text"/>
     <w:lsdException w:unhideWhenUsed="0" w:uiPriority="0" w:semiHidden="0" w:name="Body Text Indent"/>
     <w:lsdException w:unhideWhenUsed="0" w:uiPriority="0" w:semiHidden="0" w:name="List Continue"/>
@@ -537,7 +578,7 @@
     <w:lsdException w:unhideWhenUsed="0" w:uiPriority="0" w:semiHidden="0" w:name="HTML Sample"/>
     <w:lsdException w:unhideWhenUsed="0" w:uiPriority="0" w:semiHidden="0" w:name="HTML Typewriter"/>
     <w:lsdException w:unhideWhenUsed="0" w:uiPriority="0" w:semiHidden="0" w:name="HTML Variable"/>
-    <w:lsdException w:unhideWhenUsed="0" w:uiPriority="0" w:name="Normal Table"/>
+    <w:lsdException w:qFormat="1" w:unhideWhenUsed="0" w:uiPriority="0" w:name="Normal Table"/>
     <w:lsdException w:unhideWhenUsed="0" w:uiPriority="0" w:semiHidden="0" w:name="annotation subject"/>
     <w:lsdException w:unhideWhenUsed="0" w:uiPriority="0" w:semiHidden="0" w:name="Table Simple 1"/>
     <w:lsdException w:unhideWhenUsed="0" w:uiPriority="0" w:semiHidden="0" w:name="Table Simple 2"/>
@@ -702,11 +743,13 @@
   <w:style w:type="character" w:default="1" w:styleId="3">
     <w:name w:val="Default Paragraph Font"/>
     <w:semiHidden/>
+    <w:qFormat/>
     <w:uiPriority w:val="0"/>
   </w:style>
   <w:style w:type="table" w:default="1" w:styleId="2">
     <w:name w:val="Normal Table"/>
     <w:semiHidden/>
+    <w:qFormat/>
     <w:uiPriority w:val="0"/>
     <w:tblPr>
       <w:tblCellMar>

</xml_diff>